<commit_message>
fix(exp7): enlarge figures, scale up typography, and give dedicated full-width pages for maximum readability
</commit_message>
<xml_diff>
--- a/documents/Experiment_7_Report.docx
+++ b/documents/Experiment_7_Report.docx
@@ -295,13 +295,14 @@
     </w:p>
     <w:p>
       <w:pPr>
+        <w:keepNext/>
         <w:spacing w:before="120" w:after="40"/>
         <w:jc w:val="center"/>
       </w:pPr>
       <w:r>
         <w:drawing>
           <wp:inline xmlns:a="http://schemas.openxmlformats.org/drawingml/2006/main" xmlns:pic="http://schemas.openxmlformats.org/drawingml/2006/picture">
-            <wp:extent cx="5669280" cy="2815616"/>
+            <wp:extent cx="6035040" cy="3546364"/>
             <wp:docPr id="1" name="Picture 1"/>
             <wp:cNvGraphicFramePr>
               <a:graphicFrameLocks noChangeAspect="1"/>
@@ -322,7 +323,7 @@
                   <pic:spPr>
                     <a:xfrm>
                       <a:off x="0" y="0"/>
-                      <a:ext cx="5669280" cy="2815616"/>
+                      <a:ext cx="6035040" cy="3546364"/>
                     </a:xfrm>
                     <a:prstGeom prst="rect"/>
                   </pic:spPr>
@@ -986,13 +987,14 @@
     </w:p>
     <w:p>
       <w:pPr>
+        <w:keepNext/>
         <w:spacing w:before="120" w:after="40"/>
         <w:jc w:val="center"/>
       </w:pPr>
       <w:r>
         <w:drawing>
           <wp:inline xmlns:a="http://schemas.openxmlformats.org/drawingml/2006/main" xmlns:pic="http://schemas.openxmlformats.org/drawingml/2006/picture">
-            <wp:extent cx="5303520" cy="2014515"/>
+            <wp:extent cx="6035040" cy="2625700"/>
             <wp:docPr id="2" name="Picture 2"/>
             <wp:cNvGraphicFramePr>
               <a:graphicFrameLocks noChangeAspect="1"/>
@@ -1013,7 +1015,7 @@
                   <pic:spPr>
                     <a:xfrm>
                       <a:off x="0" y="0"/>
-                      <a:ext cx="5303520" cy="2014515"/>
+                      <a:ext cx="6035040" cy="2625700"/>
                     </a:xfrm>
                     <a:prstGeom prst="rect"/>
                   </pic:spPr>
@@ -1041,13 +1043,14 @@
     </w:p>
     <w:p>
       <w:pPr>
+        <w:keepNext/>
         <w:spacing w:before="120" w:after="40"/>
         <w:jc w:val="center"/>
       </w:pPr>
       <w:r>
         <w:drawing>
           <wp:inline xmlns:a="http://schemas.openxmlformats.org/drawingml/2006/main" xmlns:pic="http://schemas.openxmlformats.org/drawingml/2006/picture">
-            <wp:extent cx="5486400" cy="3200400"/>
+            <wp:extent cx="6035040" cy="4112768"/>
             <wp:docPr id="3" name="Picture 3"/>
             <wp:cNvGraphicFramePr>
               <a:graphicFrameLocks noChangeAspect="1"/>
@@ -1068,7 +1071,7 @@
                   <pic:spPr>
                     <a:xfrm>
                       <a:off x="0" y="0"/>
-                      <a:ext cx="5486400" cy="3200400"/>
+                      <a:ext cx="6035040" cy="4112768"/>
                     </a:xfrm>
                     <a:prstGeom prst="rect"/>
                   </pic:spPr>
@@ -1236,13 +1239,14 @@
     </w:p>
     <w:p>
       <w:pPr>
+        <w:keepNext/>
         <w:spacing w:before="120" w:after="40"/>
         <w:jc w:val="center"/>
       </w:pPr>
       <w:r>
         <w:drawing>
           <wp:inline xmlns:a="http://schemas.openxmlformats.org/drawingml/2006/main" xmlns:pic="http://schemas.openxmlformats.org/drawingml/2006/picture">
-            <wp:extent cx="5486400" cy="1722913"/>
+            <wp:extent cx="6035040" cy="4112768"/>
             <wp:docPr id="4" name="Picture 4"/>
             <wp:cNvGraphicFramePr>
               <a:graphicFrameLocks noChangeAspect="1"/>
@@ -1263,7 +1267,7 @@
                   <pic:spPr>
                     <a:xfrm>
                       <a:off x="0" y="0"/>
-                      <a:ext cx="5486400" cy="1722913"/>
+                      <a:ext cx="6035040" cy="4112768"/>
                     </a:xfrm>
                     <a:prstGeom prst="rect"/>
                   </pic:spPr>

</xml_diff>